<commit_message>
Make each section an interactive click-to-expand accordion
Each of the six sections (About, Experience, Leadership, Projects,
Skills, Contact) now has a clickable header with a +/- indicator that
expands or collapses its content. About starts open; the rest start
collapsed. Nav links and the hero's "Get in touch" button auto-expand
their target section before scrolling to it.

Also pulled in the latest resume wording (stronger action verbs
across Experience/Leadership bullets, refreshed Bhagat Samaj bullet)
and swapped in the updated résumé file.

Co-Authored-By: Claude Sonnet 5 <noreply@anthropic.com>
Claude-Session: https://claude.ai/code/session_01XkmZqcoeHqVd5jkggTmqW9
</commit_message>
<xml_diff>
--- a/Dev_Patel_Resume.docx
+++ b/Dev_Patel_Resume.docx
@@ -329,45 +329,45 @@
           <w:sz w:val="18"/>
           <w:szCs w:val="18"/>
         </w:rPr>
-        <w:t xml:space="preserve">Process 15–20 customer transactions daily on the teller line with strong accuracy and full regulatory compliance</w:t>
-      </w:r>
-    </w:p>
-    <w:p>
-      <w:pPr>
-        <w:pStyle w:val="ListParagraph"/>
-        <w:numPr>
-          <w:ilvl w:val="0"/>
-          <w:numId w:val="2"/>
-        </w:numPr>
-        <w:spacing w:after="20"/>
-      </w:pPr>
-      <w:r>
-        <w:rPr>
-          <w:rFonts w:ascii="Calibri" w:cs="Calibri" w:eastAsia="Calibri" w:hAnsi="Calibri"/>
-          <w:color w:val="333333"/>
-          <w:sz w:val="18"/>
-          <w:szCs w:val="18"/>
-        </w:rPr>
-        <w:t xml:space="preserve">Rotate into account maintenance and outbound client calls, proactively identifying account needs and resolving issues</w:t>
-      </w:r>
-    </w:p>
-    <w:p>
-      <w:pPr>
-        <w:pStyle w:val="ListParagraph"/>
-        <w:numPr>
-          <w:ilvl w:val="0"/>
-          <w:numId w:val="2"/>
-        </w:numPr>
-        <w:spacing w:after="20"/>
-      </w:pPr>
-      <w:r>
-        <w:rPr>
-          <w:rFonts w:ascii="Calibri" w:cs="Calibri" w:eastAsia="Calibri" w:hAnsi="Calibri"/>
-          <w:color w:val="333333"/>
-          <w:sz w:val="18"/>
-          <w:szCs w:val="18"/>
-        </w:rPr>
-        <w:t xml:space="preserve">Analyze customer financial needs and recommend appropriate banking solutions, building consultative sales and relationship-management skills</w:t>
+        <w:t xml:space="preserve">Execute 15–20 customer transactions daily on the teller line with strong accuracy and full regulatory compliance</w:t>
+      </w:r>
+    </w:p>
+    <w:p>
+      <w:pPr>
+        <w:pStyle w:val="ListParagraph"/>
+        <w:numPr>
+          <w:ilvl w:val="0"/>
+          <w:numId w:val="2"/>
+        </w:numPr>
+        <w:spacing w:after="20"/>
+      </w:pPr>
+      <w:r>
+        <w:rPr>
+          <w:rFonts w:ascii="Calibri" w:cs="Calibri" w:eastAsia="Calibri" w:hAnsi="Calibri"/>
+          <w:color w:val="333333"/>
+          <w:sz w:val="18"/>
+          <w:szCs w:val="18"/>
+        </w:rPr>
+        <w:t xml:space="preserve">Guide account maintenance and outbound client calls, proactively identifying account needs and resolving issues</w:t>
+      </w:r>
+    </w:p>
+    <w:p>
+      <w:pPr>
+        <w:pStyle w:val="ListParagraph"/>
+        <w:numPr>
+          <w:ilvl w:val="0"/>
+          <w:numId w:val="2"/>
+        </w:numPr>
+        <w:spacing w:after="20"/>
+      </w:pPr>
+      <w:r>
+        <w:rPr>
+          <w:rFonts w:ascii="Calibri" w:cs="Calibri" w:eastAsia="Calibri" w:hAnsi="Calibri"/>
+          <w:color w:val="333333"/>
+          <w:sz w:val="18"/>
+          <w:szCs w:val="18"/>
+        </w:rPr>
+        <w:t xml:space="preserve">Evaluate customer financial needs and recommend appropriate banking solutions, strengthening consultative sales and relationship-management skills</w:t>
       </w:r>
     </w:p>
     <w:p>
@@ -553,26 +553,26 @@
           <w:sz w:val="18"/>
           <w:szCs w:val="18"/>
         </w:rPr>
-        <w:t xml:space="preserve">Serve as the sole technology resource for a family-owned retail store, diagnosing and resolving hardware, software, and connectivity issues on an ongoing basis</w:t>
-      </w:r>
-    </w:p>
-    <w:p>
-      <w:pPr>
-        <w:pStyle w:val="ListParagraph"/>
-        <w:numPr>
-          <w:ilvl w:val="0"/>
-          <w:numId w:val="2"/>
-        </w:numPr>
-        <w:spacing w:after="20"/>
-      </w:pPr>
-      <w:r>
-        <w:rPr>
-          <w:rFonts w:ascii="Calibri" w:cs="Calibri" w:eastAsia="Calibri" w:hAnsi="Calibri"/>
-          <w:color w:val="333333"/>
-          <w:sz w:val="18"/>
-          <w:szCs w:val="18"/>
-        </w:rPr>
-        <w:t xml:space="preserve">Led the complete technology overhaul during a full store renovation, selecting and implementing new POS, payment, and networking systems</w:t>
+        <w:t xml:space="preserve">Operate as the sole technology resource for a family-owned retail store, diagnosing and resolving hardware, software, and connectivity issues on an ongoing basis</w:t>
+      </w:r>
+    </w:p>
+    <w:p>
+      <w:pPr>
+        <w:pStyle w:val="ListParagraph"/>
+        <w:numPr>
+          <w:ilvl w:val="0"/>
+          <w:numId w:val="2"/>
+        </w:numPr>
+        <w:spacing w:after="20"/>
+      </w:pPr>
+      <w:r>
+        <w:rPr>
+          <w:rFonts w:ascii="Calibri" w:cs="Calibri" w:eastAsia="Calibri" w:hAnsi="Calibri"/>
+          <w:color w:val="333333"/>
+          <w:sz w:val="18"/>
+          <w:szCs w:val="18"/>
+        </w:rPr>
+        <w:t xml:space="preserve">Spearheaded the complete technology overhaul during a full store renovation, selecting and implementing new POS, payment, and networking systems</w:t>
       </w:r>
     </w:p>
     <w:p>
@@ -659,7 +659,7 @@
           <w:sz w:val="18"/>
           <w:szCs w:val="18"/>
         </w:rPr>
-        <w:t xml:space="preserve">Lead executive board operations, strategic planning, and end-to-end event execution</w:t>
+        <w:t xml:space="preserve">Direct executive board operations, strategic planning, and end-to-end event execution</w:t>
       </w:r>
     </w:p>
     <w:p>
@@ -697,7 +697,7 @@
           <w:sz w:val="18"/>
           <w:szCs w:val="18"/>
         </w:rPr>
-        <w:t xml:space="preserve">Own logistics, budgeting, and team operations across the organization</w:t>
+        <w:t xml:space="preserve">Oversee logistics, budgeting, and team operations across the organization</w:t>
       </w:r>
     </w:p>
     <w:p>
@@ -746,7 +746,7 @@
           <w:sz w:val="18"/>
           <w:szCs w:val="18"/>
         </w:rPr>
-        <w:t xml:space="preserve">Plan and execute community programs and events for a 1,000+ member local community with global reach, ranging from small gatherings to large-scale celebrations (200+ attendees)</w:t>
+        <w:t xml:space="preserve">Organize and execute community programs and events for a 1,000+ member local community with global reach, ranging from small gatherings to large-scale celebrations (200+ attendees)</w:t>
       </w:r>
     </w:p>
     <w:p>
@@ -784,26 +784,26 @@
           <w:sz w:val="18"/>
           <w:szCs w:val="18"/>
         </w:rPr>
-        <w:t xml:space="preserve">Lead audio/lighting production as event DJ, and co-authored a five-year strategic growth plan (2026–2031) for the organization's DJ &amp; Lighting Program</w:t>
-      </w:r>
-    </w:p>
-    <w:p>
-      <w:pPr>
-        <w:pStyle w:val="ListParagraph"/>
-        <w:numPr>
-          <w:ilvl w:val="0"/>
-          <w:numId w:val="2"/>
-        </w:numPr>
-        <w:spacing w:after="20"/>
-      </w:pPr>
-      <w:r>
-        <w:rPr>
-          <w:rFonts w:ascii="Calibri" w:cs="Calibri" w:eastAsia="Calibri" w:hAnsi="Calibri"/>
-          <w:color w:val="333333"/>
-          <w:sz w:val="18"/>
-          <w:szCs w:val="18"/>
-        </w:rPr>
-        <w:t xml:space="preserve">Design and lead youth leadership development programming, mentoring incoming volunteers on event production and project management</w:t>
+        <w:t xml:space="preserve">Direct audio/lighting production as event DJ, formalizing operational standards and workflows for the organization's DJ &amp; Lighting Program</w:t>
+      </w:r>
+    </w:p>
+    <w:p>
+      <w:pPr>
+        <w:pStyle w:val="ListParagraph"/>
+        <w:numPr>
+          <w:ilvl w:val="0"/>
+          <w:numId w:val="2"/>
+        </w:numPr>
+        <w:spacing w:after="20"/>
+      </w:pPr>
+      <w:r>
+        <w:rPr>
+          <w:rFonts w:ascii="Calibri" w:cs="Calibri" w:eastAsia="Calibri" w:hAnsi="Calibri"/>
+          <w:color w:val="333333"/>
+          <w:sz w:val="18"/>
+          <w:szCs w:val="18"/>
+        </w:rPr>
+        <w:t xml:space="preserve">Develop and direct youth leadership development programming, mentoring incoming volunteers on event production and project management</w:t>
       </w:r>
     </w:p>
     <w:p>
@@ -940,7 +940,7 @@
           <w:sz w:val="18"/>
           <w:szCs w:val="18"/>
         </w:rPr>
-        <w:t xml:space="preserve">Built a multivariate regression model analyzing 13 variables from Spotify and YouTube data to predict song popularity (R² of 0.32–0.34); presented findings to peers and faculty, earning "Fan Favorite" recognition</w:t>
+        <w:t xml:space="preserve">Engineered a multivariate regression model analyzing 13 variables from Spotify and YouTube data to predict song popularity (R² of 0.32–0.34); presented findings to peers and faculty, earning "Fan Favorite" recognition</w:t>
       </w:r>
     </w:p>
     <w:sectPr>

</xml_diff>